<commit_message>
executed with sonnet 4 - best results
</commit_message>
<xml_diff>
--- a/filled.docx
+++ b/filled.docx
@@ -830,7 +830,7 @@
         <w:jc w:val="both"/>
       </w:pPr>
       <w:r>
-        <w:t xml:space="preserve">pentru suma de  o suta mii lei (100.000) lei, </w:t>
+        <w:t xml:space="preserve">pentru suma de  zece mii lei (10.000) lei, </w:t>
       </w:r>
     </w:p>
     <w:p>
@@ -944,7 +944,7 @@
         <w:jc w:val="both"/>
       </w:pPr>
       <w:r>
-        <w:t>3. Ne angajăm să menţinem această ofertă valabilă pentru o durată de _____________</w:t>
+        <w:t>3. Ne angajăm să menţinem această ofertă valabilă pentru o durată de  90 (nouazeci)</w:t>
       </w:r>
     </w:p>
     <w:p>
@@ -955,7 +955,7 @@
         <w:jc w:val="both"/>
       </w:pPr>
       <w:r>
-        <w:t>90 (nouazeci)______ zile, respectiv până la data de  31/01/2026__________________, şi</w:t>
+        <w:t>90_________________ zile, respectiv până la data de  31/01/2026__________________, şi</w:t>
       </w:r>
     </w:p>
     <w:p>
@@ -1148,7 +1148,7 @@
         <w:jc w:val="center"/>
       </w:pPr>
       <w:r>
-        <w:t>Maria Dobre___, în calitate de  ofertant_____________, legal autorizat să semnez</w:t>
+        <w:t>Maria Dobre___, în calitate de  Maria Dobre__________, legal autorizat să semnez</w:t>
       </w:r>
     </w:p>
     <w:p>
@@ -1502,7 +1502,7 @@
         </w:rPr>
       </w:pPr>
       <w:r>
-        <w:t>Subsemnatul, reprezentant împuternicit al  SC BestBuild SRL, Str. Lalelelor 10, Bucuresti (denumirea/numele şi sediul/adresa operatorului economic), declar pe propria răspundere, sub sancţiunea excluderii din procedură că</w:t>
+        <w:t>Subsemnatul, reprezentant împuternicit al  SC BestBuild SRL......................................... (denumirea/numele şi sediul/adresa operatorului economic), declar pe propria răspundere, sub sancţiunea excluderii din procedură că</w:t>
       </w:r>
       <w:r>
         <w:rPr>
@@ -2289,7 +2289,7 @@
         </w:rPr>
       </w:pPr>
       <w:r>
-        <w:t>Subsemnatul, reprezentant împuternicit al  SC BestBuild SRL, Str. Lalelelor 10, Bucuresti (denumirea/numele şi sediul/adresa operatorului economic), declar pe propria răspundere, sub sancţiunea excluderii din procedură, că în ultimii 3 ani</w:t>
+        <w:t>Subsemnatul, reprezentant împuternicit al  SC BestBuild SRL......................................... (denumirea/numele şi sediul/adresa operatorului economic), declar pe propria răspundere, sub sancţiunea excluderii din procedură, că în ultimii 3 ani</w:t>
       </w:r>
       <w:r>
         <w:t>:</w:t>
@@ -2997,7 +2997,7 @@
         <w:rPr>
           <w:bCs/>
         </w:rPr>
-        <w:t xml:space="preserve"> la procedura de  Licitatia pentru servicii IT_______________, declar pe proprie răspundere, următoarele: cunoscând prevederile art. 59 și 60 din Legea nr. 98/2016 privind achiziţiile publice şi componenţa listei cu persoanele ce deţin funcţii de decizie în autoritatea contractantă cu privire la organizarea, derularea şi finalizarea procedurii de atribuire, declar că societatea noastră nu se află în situaţia de a fi exclusă din procedură.</w:t>
+        <w:t xml:space="preserve"> la procedura de ____________________________________________, declar pe proprie răspundere, următoarele: cunoscând prevederile art. 59 și 60 din Legea nr. 98/2016 privind achiziţiile publice şi componenţa listei cu persoanele ce deţin funcţii de decizie în autoritatea contractantă cu privire la organizarea, derularea şi finalizarea procedurii de atribuire, declar că societatea noastră nu se află în situaţia de a fi exclusă din procedură.</w:t>
       </w:r>
     </w:p>
     <w:p>
@@ -3478,7 +3478,7 @@
         <w:rPr>
           <w:b/>
         </w:rPr>
-        <w:t>Servicii de consultanta IT..</w:t>
+        <w:t>SC Tert Support SRL........</w:t>
       </w:r>
     </w:p>
     <w:p>
@@ -3611,7 +3611,7 @@
         <w:jc w:val="both"/>
       </w:pPr>
       <w:r>
-        <w:t>În acest sens, ne obligăm în mod ferm, necondiţionat şi irevocabil, să punem la dispoziţia  SC BestBuild SRL (denumirea ofertantului/ grupului de operatori economici) resursele tehnice şi/sau profesionale de  Echipa de 3 specialisti si echipamente test ..................................................................necesare pentru îndeplinirea integrală, reglementară şi la termen a contractului de achiziţie publică.</w:t>
+        <w:t>În acest sens, ne obligăm în mod ferm, necondiţionat şi irevocabil, să punem la dispoziţia  SC BestBuild SRL (denumirea ofertantului/ grupului de operatori economici) resursele tehnice şi/sau profesionale de ................................................ ..................................................................necesare pentru îndeplinirea integrală, reglementară şi la termen a contractului de achiziţie publică.</w:t>
       </w:r>
     </w:p>
     <w:p>
@@ -4085,7 +4085,7 @@
           <w:sz w:val="22"/>
           <w:szCs w:val="22"/>
         </w:rPr>
-        <w:t>Subsemnatul  Andrei Georgescu___ [</w:t>
+        <w:t>Subsemnatul  Maria Dobre________ [</w:t>
       </w:r>
       <w:r>
         <w:rPr>
@@ -4101,7 +4101,7 @@
           <w:sz w:val="22"/>
           <w:szCs w:val="22"/>
         </w:rPr>
-        <w:t>, reprezentant împuternicit al  SC BestBuild SRL, Str. Lalelelor 10, Bucuresti [</w:t>
+        <w:t>, reprezentant împuternicit al  SC BestBuild SRL_______________ [</w:t>
       </w:r>
       <w:r>
         <w:rPr>
@@ -4133,7 +4133,7 @@
           <w:szCs w:val="22"/>
         </w:rPr>
         <w:tab/>
-        <w:t>Subsemnatul,  Andrei Georgescu_______. declar ca informaţiile furnizate sunt complete şi corecte în fiecare detaliu şi înţeleg că autoritatea contractantă are dreptul de a solicita, în scopul verificării şi confirmării declaraţiilor, situaţiilor şi documentelor care însoţesc oferta, orice informaţii suplimentare în scopul verificării datelor din prezenta declaraţie.</w:t>
+        <w:t>Subsemnatul,  Maria Dobre____________. declar ca informaţiile furnizate sunt complete şi corecte în fiecare detaliu şi înţeleg că autoritatea contractantă are dreptul de a solicita, în scopul verificării şi confirmării declaraţiilor, situaţiilor şi documentelor care însoţesc oferta, orice informaţii suplimentare în scopul verificării datelor din prezenta declaraţie.</w:t>
       </w:r>
     </w:p>
     <w:p>
@@ -4149,7 +4149,7 @@
           <w:sz w:val="22"/>
           <w:szCs w:val="22"/>
         </w:rPr>
-        <w:t>Subsemnatul autorizez prin prezenta orice instituţie, societate comercială, bancă, alte persoane juridice să furnizeze informaţii reprezentanţilor autorizaţi ai  Autoritatea Contractanta X, Str. Exemplu 123, Bucuresti [</w:t>
+        <w:t>Subsemnatul autorizez prin prezenta orice instituţie, societate comercială, bancă, alte persoane juridice să furnizeze informaţii reprezentanţilor autorizaţi ai  Autoritatea Contractanta X [</w:t>
       </w:r>
       <w:r>
         <w:rPr>
@@ -7770,7 +7770,7 @@
         <w:rPr>
           <w:bCs/>
         </w:rPr>
-        <w:t xml:space="preserve">încheiat între  SC BestBuild SRL_ , în calitate de contractant, şi  Autoritatea Contractanta X, Str. Exemplu 123, Bucuresti, în calitate de achizitor, ne obligăm prin prezenta să plătim în favoarea achizitorului, până la concurenţa sumei de  100000 RON, 10% reprezentând  100000 RON, 10%% din valoarea contractului respectiv, orice sumă cerută de acesta însoţită de o declaraţie cu privire la neîndeplinirea obligaţiilor ce revin contractantului, astfel cum sunt acestea prevazute în contractul de achiziţie publică mai sus menţionat. </w:t>
+        <w:t xml:space="preserve">încheiat între  SC BestBuild SRL_ , în calitate de contractant, şi  Autoritatea Contractanta X, în calitate de achizitor, ne obligăm prin prezenta să plătim în favoarea achizitorului, până la concurenţa sumei de  100.000_____ reprezentând ______% din valoarea contractului respectiv, orice sumă cerută de acesta însoţită de o declaraţie cu privire la neîndeplinirea obligaţiilor ce revin contractantului, astfel cum sunt acestea prevazute în contractul de achiziţie publică mai sus menţionat. </w:t>
       </w:r>
     </w:p>
     <w:p>
@@ -8577,7 +8577,7 @@
           <w:i/>
           <w:iCs/>
         </w:rPr>
-        <w:t xml:space="preserve"> Iulian Matei, Administrator</w:t>
+        <w:t xml:space="preserve"> Iulian Matei............</w:t>
       </w:r>
       <w:r>
         <w:rPr>
@@ -8607,7 +8607,7 @@
           <w:i/>
           <w:iCs/>
         </w:rPr>
-        <w:t xml:space="preserve"> Iulian Matei, Administrator</w:t>
+        <w:t xml:space="preserve"> Administrator....</w:t>
       </w:r>
     </w:p>
     <w:p>
@@ -8693,7 +8693,7 @@
           <w:i/>
           <w:iCs/>
         </w:rPr>
-        <w:t xml:space="preserve"> Radu Munteanu, Administrator</w:t>
+        <w:t xml:space="preserve"> Radu Munteanu.....</w:t>
       </w:r>
       <w:r>
         <w:rPr>
@@ -8716,7 +8716,7 @@
           <w:i/>
           <w:iCs/>
         </w:rPr>
-        <w:t xml:space="preserve"> Radu Munteanu, Administrator</w:t>
+        <w:t xml:space="preserve"> Administrator...</w:t>
       </w:r>
     </w:p>
     <w:p>
@@ -9783,7 +9783,7 @@
           <w:iCs/>
           <w:lang w:val="es-ES"/>
         </w:rPr>
-        <w:t>1.  60% SC Partener 1 SRL % S.C.  SC Partener 1 SRL, Str. Parteneriat 1, Bucuresti, 0210000000</w:t>
+        <w:t>1.  60%___ % S.C.  SC Partener 1 SRL_________</w:t>
       </w:r>
     </w:p>
     <w:p>
@@ -9803,7 +9803,7 @@
           <w:iCs/>
           <w:lang w:val="es-ES"/>
         </w:rPr>
-        <w:t>2.  40% SC Partener 2 SRL % S.C.  SC Partener 2 SRL, Str. Alianta 2, Cluj, 0264000000</w:t>
+        <w:t>2.  40%___ % S.C.  SC Partener 2 SRL_________</w:t>
       </w:r>
     </w:p>
     <w:p>
@@ -10122,7 +10122,7 @@
           <w:iCs/>
           <w:lang w:val="it-IT"/>
         </w:rPr>
-        <w:t>1.  60% SC Partener 1 SRL % S.C.  SC Partener 1 SRL, Str. Parteneriat 1, Bucuresti, 0210000000</w:t>
+        <w:t>1.  60%___ % S.C.  SC Partener 1 SRL_________</w:t>
       </w:r>
     </w:p>
     <w:p>
@@ -10142,7 +10142,7 @@
           <w:iCs/>
           <w:lang w:val="it-IT"/>
         </w:rPr>
-        <w:t>2.  40% SC Partener 2 SRL % S.C.  SC Partener 2 SRL, Str. Alianta 2, Cluj, 0264000000</w:t>
+        <w:t>2.  40%___ % S.C.  SC Partener 2 SRL_________</w:t>
       </w:r>
     </w:p>
     <w:p>
@@ -10562,7 +10562,7 @@
           <w:iCs/>
           <w:lang w:val="pt-BR"/>
         </w:rPr>
-        <w:t xml:space="preserve"> Orice comunicare între părţi este valabil îndeplinită dacă se va face în scris şi va fi transmisă la adresa/adresele  Autoritatea Contractanta X, Str. Exemplu 123, Bucuresti, prevăzute la art.  SC Partener 1 SRL, Str. Parteneriat 1, Bucuresti, 0210000000</w:t>
+        <w:t xml:space="preserve"> Orice comunicare între părţi este valabil îndeplinită dacă se va face în scris şi va fi transmisă la adresa/adresele  Autoritatea Contractanta X, Str. Exemplu 123, Bucuresti, prevăzute la art. .........</w:t>
       </w:r>
     </w:p>
     <w:p>
@@ -10726,7 +10726,7 @@
           <w:iCs/>
           <w:lang w:val="it-IT"/>
         </w:rPr>
-        <w:t xml:space="preserve">          Prezentul acord a fost încheiat într-un număr de  08/10/2025 exemplare, câte unul pentru fiecare parte, astăzi  08/10/2025........ (data semnării lui).</w:t>
+        <w:t xml:space="preserve">          Prezentul acord a fost încheiat într-un număr de  2025-10-08 exemplare, câte unul pentru fiecare parte, astăzi  2025-10-08....... (data semnării lui).</w:t>
       </w:r>
     </w:p>
     <w:p>
@@ -10790,7 +10790,7 @@
           <w:iCs/>
           <w:lang w:val="it-IT"/>
         </w:rPr>
-        <w:t>SC Partener 1 SRL_____</w:t>
+        <w:t>Autoritatea Contractanta X</w:t>
       </w:r>
     </w:p>
     <w:p>
@@ -11471,7 +11471,7 @@
           <w:i/>
           <w:iCs/>
         </w:rPr>
-        <w:t>la contractul  nr.  45/2025 intre Autoritatea Contractanta X si SC BestBuild SRL încheiat între  45/2025 intre Autoritatea Contractanta X si SC BestBuild SRL</w:t>
+        <w:t>la contractul  nr.  45/2025_______ încheiat între  Autoritatea Contractanta X si SC BestBuild SRL</w:t>
       </w:r>
     </w:p>
     <w:p>
@@ -11554,43 +11554,43 @@
           <w:i/>
           <w:iCs/>
         </w:rPr>
-        <w:t>Acest contract este încheiat între S.C.  SC BestBuild SRL, Str. Lalelelor 10, Bucuresti cu sediul în  SC BestBuild SRL, Str. Lalelelor 10, Bucuresti</w:t>
-      </w:r>
-    </w:p>
-    <w:p>
-      <w:pPr>
-        <w:tabs>
-          <w:tab w:val="left" w:pos="1593"/>
-        </w:tabs>
-        <w:rPr>
-          <w:i/>
-          <w:iCs/>
-        </w:rPr>
-      </w:pPr>
-      <w:r>
-        <w:rPr>
-          <w:i/>
-          <w:iCs/>
-        </w:rPr>
-        <w:t>SC BestBuild SRL, Str. Lalelelor 10, Bucuresti, 0212345678, 0212345679 (adresa,tel.,fax), reprezentată prin  Ionescu Mihai, Administrator Director General şi</w:t>
-      </w:r>
-    </w:p>
-    <w:p>
-      <w:pPr>
-        <w:tabs>
-          <w:tab w:val="left" w:pos="1593"/>
-        </w:tabs>
-        <w:rPr>
-          <w:i/>
-          <w:iCs/>
-        </w:rPr>
-      </w:pPr>
-      <w:r>
-        <w:rPr>
-          <w:i/>
-          <w:iCs/>
-        </w:rPr>
-        <w:t>Ionescu Mihai, Administrator Director Economic, denumită în cele ce urmează contractant general</w:t>
+        <w:t>Acest contract este încheiat între S.C.  SC BestBuild SRL cu sediul în  Bucuresti________________</w:t>
+      </w:r>
+    </w:p>
+    <w:p>
+      <w:pPr>
+        <w:tabs>
+          <w:tab w:val="left" w:pos="1593"/>
+        </w:tabs>
+        <w:rPr>
+          <w:i/>
+          <w:iCs/>
+        </w:rPr>
+      </w:pPr>
+      <w:r>
+        <w:rPr>
+          <w:i/>
+          <w:iCs/>
+        </w:rPr>
+        <w:t>Str. Lalelelor 10, Bucuresti (adresa,tel.,fax), reprezentată prin  Popescu__________ Director General şi</w:t>
+      </w:r>
+    </w:p>
+    <w:p>
+      <w:pPr>
+        <w:tabs>
+          <w:tab w:val="left" w:pos="1593"/>
+        </w:tabs>
+        <w:rPr>
+          <w:i/>
+          <w:iCs/>
+        </w:rPr>
+      </w:pPr>
+      <w:r>
+        <w:rPr>
+          <w:i/>
+          <w:iCs/>
+        </w:rPr>
+        <w:t>Ionescu____ Director Economic, denumită în cele ce urmează contractant general</w:t>
       </w:r>
     </w:p>
     <w:p>
@@ -11626,25 +11626,25 @@
           <w:i/>
           <w:iCs/>
         </w:rPr>
-        <w:t xml:space="preserve">S.C.  SC BestBuild SRL, Str. Lalelelor 10, Bucuresti cu sediul în  SC BestBuild SRL, Str. Lalelelor 10, Bucuresti, 0212345678, 0212345679 (adresa,tel.,fax)                                                     </w:t>
-      </w:r>
-    </w:p>
-    <w:p>
-      <w:pPr>
-        <w:tabs>
-          <w:tab w:val="left" w:pos="1593"/>
-        </w:tabs>
-        <w:rPr>
-          <w:i/>
-          <w:iCs/>
-        </w:rPr>
-      </w:pPr>
-      <w:r>
-        <w:rPr>
-          <w:i/>
-          <w:iCs/>
-        </w:rPr>
-        <w:t>reprezentată prin  Ionescu Mihai, Administrator Director General şi  Ionescu Mihai, Administrator Director Economic, denumită în cele ce urmează subcontractant.</w:t>
+        <w:t xml:space="preserve">S.C.  SC SubEx SRL___________ cu sediul în  Cluj____________________________ (adresa,tel.,fax)                                                     </w:t>
+      </w:r>
+    </w:p>
+    <w:p>
+      <w:pPr>
+        <w:tabs>
+          <w:tab w:val="left" w:pos="1593"/>
+        </w:tabs>
+        <w:rPr>
+          <w:i/>
+          <w:iCs/>
+        </w:rPr>
+      </w:pPr>
+      <w:r>
+        <w:rPr>
+          <w:i/>
+          <w:iCs/>
+        </w:rPr>
+        <w:t>reprezentată prin  Vasilescu________ Director General şi  Matei______________ Director Economic, denumită în cele ce urmează subcontractant.</w:t>
       </w:r>
     </w:p>
     <w:p>
@@ -11717,7 +11717,7 @@
           <w:i/>
           <w:iCs/>
         </w:rPr>
-        <w:t xml:space="preserve">  Suport tehnic_______ ce fac obiectul prezentului contract sunt Administrare infrastructura de:</w:t>
+        <w:t xml:space="preserve">  Servicii de consultanta IT ce fac obiectul prezentului contract sunt Suport tehnic___ de:</w:t>
       </w:r>
     </w:p>
     <w:p>
@@ -11758,7 +11758,7 @@
           <w:i/>
           <w:iCs/>
         </w:rPr>
-        <w:t>____________________</w:t>
+        <w:t>Suport tehnic_______</w:t>
       </w:r>
     </w:p>
     <w:p>
@@ -11781,7 +11781,7 @@
           <w:i/>
           <w:iCs/>
         </w:rPr>
-        <w:t>____________________.</w:t>
+        <w:t>Administrare infrastructura.</w:t>
       </w:r>
     </w:p>
     <w:p>
@@ -11902,7 +11902,7 @@
           <w:i/>
           <w:iCs/>
         </w:rPr>
-        <w:t>- lunar, în termen de  lunar, in 30 zile de la factura (zile) de la primirea de către contractantul general a facturii întocmite de subcontractant, contravaloarea ___________________ prestate în perioada respectivă.</w:t>
+        <w:t>- lunar, în termen de  90____ (zile) de la primirea de către contractantul general a facturii întocmite de subcontractant, contravaloarea  Servicii de consultanta IT prestate în perioada respectivă.</w:t>
       </w:r>
     </w:p>
     <w:p>
@@ -11938,7 +11938,7 @@
           <w:i/>
           <w:iCs/>
         </w:rPr>
-        <w:t>- plata  lunar, in 30 zile de la factura se va face în limita asigurarii finanţării  150000 RON___________</w:t>
+        <w:t>- plata  Servicii de consultanta IT se va face în limita asigurarii finanţării  Servicii de consultanta IT</w:t>
       </w:r>
     </w:p>
     <w:p>
@@ -11974,7 +11974,7 @@
           <w:i/>
           <w:iCs/>
         </w:rPr>
-        <w:t>Autoritatea Contractanta X__ de către beneficiarul  Autoritatea Contractanta X, Str. Exemplu 123, Bucuresti .</w:t>
+        <w:t>Servicii de consultanta IT__ de către beneficiarul  Autoritatea Contractanta X .</w:t>
       </w:r>
     </w:p>
     <w:p>
@@ -12030,7 +12030,7 @@
           <w:i/>
           <w:iCs/>
         </w:rPr>
-        <w:t xml:space="preserve"> Durata de execuţie a  Servicii de mentenanta IT_________________ este în                                                  </w:t>
+        <w:t xml:space="preserve"> Durata de execuţie a  Servicii de consultanta IT________________ este în                                                  </w:t>
       </w:r>
       <w:r>
         <w:rPr>
@@ -12128,7 +12128,7 @@
           <w:i/>
           <w:iCs/>
         </w:rPr>
-        <w:t xml:space="preserve"> Durata garantiei de buna executie este de  12_ luni si incepe de la data semnarii procesului verbal incheiat la terminarea  12 luni_________________________.</w:t>
+        <w:t xml:space="preserve"> Durata garantiei de buna executie este de  12_ luni si incepe de la data semnarii procesului verbal incheiat la terminarea  Servicii de consultanta IT______.</w:t>
       </w:r>
     </w:p>
     <w:p>
@@ -12231,7 +12231,7 @@
           <w:i/>
           <w:iCs/>
         </w:rPr>
-        <w:t xml:space="preserve"> Pentru nerespectarea termenului de finalizare a  Servicii de mentenanta IT________________</w:t>
+        <w:t xml:space="preserve"> Pentru nerespectarea termenului de finalizare a  Servicii de consultanta IT_______________</w:t>
       </w:r>
     </w:p>
     <w:p>
@@ -12267,7 +12267,7 @@
           <w:i/>
           <w:iCs/>
         </w:rPr>
-        <w:t>şi neîncadrarea din vina subcontractantului,  în durata de execuţie angajată de contractantul general în faţa beneficiarului, subcontractantul va plăti penalitati de  0.1% pe zi intarziere% pe zi întarziere din valoarea  150000 RON__________________ nerealizată la termen.</w:t>
+        <w:t>şi neîncadrarea din vina subcontractantului,  în durata de execuţie angajată de contractantul general în faţa beneficiarului, subcontractantul va plăti penalitati de  0.1__% pe zi întarziere din valoarea  150000 RON__________________ nerealizată la termen.</w:t>
       </w:r>
     </w:p>
     <w:p>
@@ -12314,7 +12314,7 @@
           <w:i/>
           <w:iCs/>
         </w:rPr>
-        <w:t>Pentru nerespectarea termenelor de plata prevazute la art.3., contractantul general va plătii penalitati de  0.05% pe zi intarziere % pe zi întarziere la suma datorată.</w:t>
+        <w:t>Pentru nerespectarea termenelor de plata prevazute la art.3., contractantul general va plătii penalitati de  0.05 % pe zi întarziere la suma datorată.</w:t>
       </w:r>
     </w:p>
     <w:p>
@@ -12493,7 +12493,7 @@
           <w:i/>
           <w:iCs/>
         </w:rPr>
-        <w:t>SC BestBuild SRL_                                                                    SC SubEx SRL, Cluj; DG: Vasilescu, DE: Matei</w:t>
+        <w:t>SC BestBuild SRL_                                                                    SC SubEx SRL____</w:t>
       </w:r>
     </w:p>
     <w:p>
@@ -12970,7 +12970,7 @@
           <w:i/>
           <w:lang w:val="hu-HU"/>
         </w:rPr>
-        <w:t>se va completa cu denumirea obiectivului), cod CPV  Servicii de consultanta IT organizată de  Autoritatea Contractanta X, Str. Exemplu 123, Bucuresti în calitate de autoritate contractantă</w:t>
+        <w:t>se va completa cu denumirea obiectivului), cod CPV ........................... organizată de  Autoritatea Contractanta X, Str. Exemplu 123, Bucuresti în calitate de autoritate contractantă</w:t>
       </w:r>
       <w:r>
         <w:rPr>
@@ -13113,7 +13113,7 @@
           <w:bCs/>
           <w:lang w:val="hu-HU" w:eastAsia="ar-SA"/>
         </w:rPr>
-        <w:t xml:space="preserve"> Maria Dobre </w:t>
+        <w:t xml:space="preserve">……….. </w:t>
       </w:r>
       <w:r>
         <w:rPr>
@@ -13315,7 +13315,7 @@
         <w:rPr>
           <w:lang w:val="hu-HU" w:eastAsia="ar-SA"/>
         </w:rPr>
-        <w:t xml:space="preserve">Prezenta garanție este valabila pana la data de 31/01/2026__ zile de la data emiterii </w:t>
+        <w:t xml:space="preserve">Prezenta garanție este valabila pana la data de______ / ____ zile de la data emiterii </w:t>
       </w:r>
     </w:p>
     <w:p>
@@ -13408,7 +13408,7 @@
           <w:szCs w:val="22"/>
           <w:lang w:val="pt-BR"/>
         </w:rPr>
-        <w:t>Parafata de Banca  Banca Exemplu SA in ziua  day__ luna  month__ anul  year</w:t>
+        <w:t>Parafata de Banca  Banca Exemplu SA in ziua  01___ luna  10_____ anul  2025</w:t>
       </w:r>
     </w:p>
     <w:p>
@@ -13448,7 +13448,7 @@
           <w:i/>
           <w:iCs/>
         </w:rPr>
-        <w:t>Licitatia deschisa</w:t>
+        <w:t>SC BestBuild SRL</w:t>
       </w:r>
     </w:p>
     <w:p>
@@ -13556,7 +13556,7 @@
           <w:i/>
           <w:iCs/>
         </w:rPr>
-        <w:t>(se va completa cu denumirea obiectivului), organizată de Autoritatea Contractanta X, Str. Exemplu 123, Bucurestiîn scopul atribuirii contractului.</w:t>
+        <w:t>(se va completa cu denumirea obiectivului), organizată de Autoritatea Contractanta Xîn scopul atribuirii contractului.</w:t>
       </w:r>
     </w:p>
     <w:p>
@@ -14152,7 +14152,7 @@
           <w:i/>
           <w:iCs/>
         </w:rPr>
-        <w:t xml:space="preserve">Popa Andreea........................                                                      </w:t>
+        <w:t xml:space="preserve">..............................................                                                      </w:t>
       </w:r>
     </w:p>
     <w:p>
@@ -14621,7 +14621,7 @@
         <w:rPr>
           <w:lang w:val="it-IT"/>
         </w:rPr>
-        <w:t>iei de participare nr.  ANUNT 123 din 2025-09-15 din  ANUNT 123 din 2025-09-15, privind aplicarea procedurii de  Licitatia deschisa_</w:t>
+        <w:t>iei de participare nr. ______ din ______________, privind aplicarea procedurii de  Licitatia deschisa_</w:t>
       </w:r>
       <w:r>
         <w:rPr>
@@ -14723,7 +14723,7 @@
         <w:rPr>
           <w:lang w:val="it-IT"/>
         </w:rPr>
-        <w:t>i marcat în mod vizibil, conţinând, în original şi într-un număr de  90 (nouazeci) copii:</w:t>
+        <w:t>i marcat în mod vizibil, conţinând, în original şi într-un număr de ________ copii:</w:t>
       </w:r>
     </w:p>
     <w:p>

</xml_diff>

<commit_message>
modified expand_keys, mapper, run_pipeline
</commit_message>
<xml_diff>
--- a/filled.docx
+++ b/filled.docx
@@ -830,7 +830,7 @@
         <w:jc w:val="both"/>
       </w:pPr>
       <w:r>
-        <w:t xml:space="preserve">pentru suma de  zece mii lei (10.000) lei, </w:t>
+        <w:t xml:space="preserve">pentru suma de  o suta mii lei (100.000) lei, </w:t>
       </w:r>
     </w:p>
     <w:p>
@@ -955,7 +955,7 @@
         <w:jc w:val="both"/>
       </w:pPr>
       <w:r>
-        <w:t>90_________________ zile, respectiv până la data de  31/01/2026__________________, şi</w:t>
+        <w:t>nouazeci___________ zile, respectiv până la data de  31/01/2026__________________, şi</w:t>
       </w:r>
     </w:p>
     <w:p>
@@ -1148,7 +1148,7 @@
         <w:jc w:val="center"/>
       </w:pPr>
       <w:r>
-        <w:t>Maria Dobre___, în calitate de  Maria Dobre__________, legal autorizat să semnez</w:t>
+        <w:t>Maria Dobre___, în calitate de  Administrator________, legal autorizat să semnez</w:t>
       </w:r>
     </w:p>
     <w:p>
@@ -2991,13 +2991,13 @@
           <w:bCs/>
           <w:i/>
         </w:rPr>
-        <w:t xml:space="preserve"> ofertant_________________________________ (candidat/ofertant/ofertant asociat/terţ susţinător al candidatului/ofertantului__________________) </w:t>
-      </w:r>
-      <w:r>
-        <w:rPr>
-          <w:bCs/>
-        </w:rPr>
-        <w:t xml:space="preserve"> la procedura de ____________________________________________, declar pe proprie răspundere, următoarele: cunoscând prevederile art. 59 și 60 din Legea nr. 98/2016 privind achiziţiile publice şi componenţa listei cu persoanele ce deţin funcţii de decizie în autoritatea contractantă cu privire la organizarea, derularea şi finalizarea procedurii de atribuire, declar că societatea noastră nu se află în situaţia de a fi exclusă din procedură.</w:t>
+        <w:t xml:space="preserve"> ofertant_________________________________ (candidat/ofertant/ofertant asociat/terţ susţinător al candidatului/ofertantului ofertant_________) </w:t>
+      </w:r>
+      <w:r>
+        <w:rPr>
+          <w:bCs/>
+        </w:rPr>
+        <w:t xml:space="preserve"> la procedura de  Licitatia deschisa_________________________, declar pe proprie răspundere, următoarele: cunoscând prevederile art. 59 și 60 din Legea nr. 98/2016 privind achiziţiile publice şi componenţa listei cu persoanele ce deţin funcţii de decizie în autoritatea contractantă cu privire la organizarea, derularea şi finalizarea procedurii de atribuire, declar că societatea noastră nu se află în situaţia de a fi exclusă din procedură.</w:t>
       </w:r>
     </w:p>
     <w:p>
@@ -3027,7 +3027,7 @@
         <w:rPr>
           <w:bCs/>
         </w:rPr>
-        <w:t>dl.  Popa Mihai............., dna. Ionescu Ana......</w:t>
+        <w:t>dl.  Popa Mihai, dna. Ionescu Ana, dna dl. Popa Mihai, dna. Ionescu Ana</w:t>
       </w:r>
     </w:p>
     <w:p>
@@ -3611,7 +3611,7 @@
         <w:jc w:val="both"/>
       </w:pPr>
       <w:r>
-        <w:t>În acest sens, ne obligăm în mod ferm, necondiţionat şi irevocabil, să punem la dispoziţia  SC BestBuild SRL (denumirea ofertantului/ grupului de operatori economici) resursele tehnice şi/sau profesionale de ................................................ ..................................................................necesare pentru îndeplinirea integrală, reglementară şi la termen a contractului de achiziţie publică.</w:t>
+        <w:t>În acest sens, ne obligăm în mod ferm, necondiţionat şi irevocabil, să punem la dispoziţia  SC BestBuild SRL (denumirea ofertantului/ grupului de operatori economici) resursele tehnice şi/sau profesionale de  Echipa de 3 specialisti si echipamente test ..................................................................necesare pentru îndeplinirea integrală, reglementară şi la termen a contractului de achiziţie publică.</w:t>
       </w:r>
     </w:p>
     <w:p>
@@ -7770,7 +7770,7 @@
         <w:rPr>
           <w:bCs/>
         </w:rPr>
-        <w:t xml:space="preserve">încheiat între  SC BestBuild SRL_ , în calitate de contractant, şi  Autoritatea Contractanta X, în calitate de achizitor, ne obligăm prin prezenta să plătim în favoarea achizitorului, până la concurenţa sumei de  100.000_____ reprezentând ______% din valoarea contractului respectiv, orice sumă cerută de acesta însoţită de o declaraţie cu privire la neîndeplinirea obligaţiilor ce revin contractantului, astfel cum sunt acestea prevazute în contractul de achiziţie publică mai sus menţionat. </w:t>
+        <w:t xml:space="preserve">încheiat între  SC BestBuild SRL_ , în calitate de contractant, şi  Autoritatea Contractanta X, în calitate de achizitor, ne obligăm prin prezenta să plătim în favoarea achizitorului, până la concurenţa sumei de  100000 RON__ reprezentând  10%__% din valoarea contractului respectiv, orice sumă cerută de acesta însoţită de o declaraţie cu privire la neîndeplinirea obligaţiilor ce revin contractantului, astfel cum sunt acestea prevazute în contractul de achiziţie publică mai sus menţionat. </w:t>
       </w:r>
     </w:p>
     <w:p>
@@ -9639,7 +9639,7 @@
           <w:iCs/>
           <w:lang w:val="es-ES"/>
         </w:rPr>
-        <w:t>… ___________________________________</w:t>
+        <w:t>…  60% SC Partener 1 SRL_____________</w:t>
       </w:r>
     </w:p>
     <w:p>
@@ -10562,7 +10562,7 @@
           <w:iCs/>
           <w:lang w:val="pt-BR"/>
         </w:rPr>
-        <w:t xml:space="preserve"> Orice comunicare între părţi este valabil îndeplinită dacă se va face în scris şi va fi transmisă la adresa/adresele  Autoritatea Contractanta X, Str. Exemplu 123, Bucuresti, prevăzute la art. .........</w:t>
+        <w:t xml:space="preserve"> Orice comunicare între părţi este valabil îndeplinită dacă se va face în scris şi va fi transmisă la adresa/adresele ......................................................., prevăzute la art. .........</w:t>
       </w:r>
     </w:p>
     <w:p>
@@ -10726,7 +10726,7 @@
           <w:iCs/>
           <w:lang w:val="it-IT"/>
         </w:rPr>
-        <w:t xml:space="preserve">          Prezentul acord a fost încheiat într-un număr de  2025-10-08 exemplare, câte unul pentru fiecare parte, astăzi  2025-10-08....... (data semnării lui).</w:t>
+        <w:t xml:space="preserve">          Prezentul acord a fost încheiat într-un număr de  2.. exemplare, câte unul pentru fiecare parte, astăzi  01/09/2025........ (data semnării lui).</w:t>
       </w:r>
     </w:p>
     <w:p>
@@ -10862,7 +10862,7 @@
           <w:iCs/>
           <w:lang w:val="it-IT"/>
         </w:rPr>
-        <w:t>SC Partener 1 SRL, Str. Parteneriat 1, Bucuresti, 0210000000</w:t>
+        <w:t>Iulian Matei, Administrator</w:t>
       </w:r>
     </w:p>
     <w:p>
@@ -10914,7 +10914,7 @@
           <w:iCs/>
           <w:lang w:val="it-IT"/>
         </w:rPr>
-        <w:t>SC Partener 2 SRL, Str. Alianta 2, Cluj, 0264000000</w:t>
+        <w:t>Radu Munteanu, Administrator</w:t>
       </w:r>
     </w:p>
     <w:p>
@@ -11471,25 +11471,25 @@
           <w:i/>
           <w:iCs/>
         </w:rPr>
-        <w:t>la contractul  nr.  45/2025_______ încheiat între  Autoritatea Contractanta X si SC BestBuild SRL</w:t>
-      </w:r>
-    </w:p>
-    <w:p>
-      <w:pPr>
-        <w:tabs>
-          <w:tab w:val="left" w:pos="1593"/>
-        </w:tabs>
-        <w:rPr>
-          <w:i/>
-          <w:iCs/>
-        </w:rPr>
-      </w:pPr>
-      <w:r>
-        <w:rPr>
-          <w:i/>
-          <w:iCs/>
-        </w:rPr>
-        <w:t>__________________________   (părţile contractante) privind furnizarea produselor  Servicii de consultanta IT                                                                                                                      (denumire contract)</w:t>
+        <w:t>la contractul  nr.  45/2025_______ încheiat între  Autoritatea Contractanta X___</w:t>
+      </w:r>
+    </w:p>
+    <w:p>
+      <w:pPr>
+        <w:tabs>
+          <w:tab w:val="left" w:pos="1593"/>
+        </w:tabs>
+        <w:rPr>
+          <w:i/>
+          <w:iCs/>
+        </w:rPr>
+      </w:pPr>
+      <w:r>
+        <w:rPr>
+          <w:i/>
+          <w:iCs/>
+        </w:rPr>
+        <w:t>SC BestBuild SRL__________   (părţile contractante) privind furnizarea produselor  Servicii de consultanta IT                                                                                                                      (denumire contract)</w:t>
       </w:r>
     </w:p>
     <w:p>
@@ -11554,43 +11554,43 @@
           <w:i/>
           <w:iCs/>
         </w:rPr>
-        <w:t>Acest contract este încheiat între S.C.  SC BestBuild SRL cu sediul în  Bucuresti________________</w:t>
-      </w:r>
-    </w:p>
-    <w:p>
-      <w:pPr>
-        <w:tabs>
-          <w:tab w:val="left" w:pos="1593"/>
-        </w:tabs>
-        <w:rPr>
-          <w:i/>
-          <w:iCs/>
-        </w:rPr>
-      </w:pPr>
-      <w:r>
-        <w:rPr>
-          <w:i/>
-          <w:iCs/>
-        </w:rPr>
-        <w:t>Str. Lalelelor 10, Bucuresti (adresa,tel.,fax), reprezentată prin  Popescu__________ Director General şi</w:t>
-      </w:r>
-    </w:p>
-    <w:p>
-      <w:pPr>
-        <w:tabs>
-          <w:tab w:val="left" w:pos="1593"/>
-        </w:tabs>
-        <w:rPr>
-          <w:i/>
-          <w:iCs/>
-        </w:rPr>
-      </w:pPr>
-      <w:r>
-        <w:rPr>
-          <w:i/>
-          <w:iCs/>
-        </w:rPr>
-        <w:t>Ionescu____ Director Economic, denumită în cele ce urmează contractant general</w:t>
+        <w:t>Acest contract este încheiat între S.C.  SC BestBuild SRL, Bucuresti; DG: Popescu, DE: Ionescu cu sediul în  Str. Lalelelor 10, Bucuresti</w:t>
+      </w:r>
+    </w:p>
+    <w:p>
+      <w:pPr>
+        <w:tabs>
+          <w:tab w:val="left" w:pos="1593"/>
+        </w:tabs>
+        <w:rPr>
+          <w:i/>
+          <w:iCs/>
+        </w:rPr>
+      </w:pPr>
+      <w:r>
+        <w:rPr>
+          <w:i/>
+          <w:iCs/>
+        </w:rPr>
+        <w:t>Str. Lalelelor 10, Bucuresti (adresa,tel.,fax), reprezentată prin  Ionescu Mihai____ Director General şi</w:t>
+      </w:r>
+    </w:p>
+    <w:p>
+      <w:pPr>
+        <w:tabs>
+          <w:tab w:val="left" w:pos="1593"/>
+        </w:tabs>
+        <w:rPr>
+          <w:i/>
+          <w:iCs/>
+        </w:rPr>
+      </w:pPr>
+      <w:r>
+        <w:rPr>
+          <w:i/>
+          <w:iCs/>
+        </w:rPr>
+        <w:t>Ionescu Mihai Director Economic, denumită în cele ce urmează contractant general</w:t>
       </w:r>
     </w:p>
     <w:p>
@@ -11626,25 +11626,25 @@
           <w:i/>
           <w:iCs/>
         </w:rPr>
-        <w:t xml:space="preserve">S.C.  SC SubEx SRL___________ cu sediul în  Cluj____________________________ (adresa,tel.,fax)                                                     </w:t>
-      </w:r>
-    </w:p>
-    <w:p>
-      <w:pPr>
-        <w:tabs>
-          <w:tab w:val="left" w:pos="1593"/>
-        </w:tabs>
-        <w:rPr>
-          <w:i/>
-          <w:iCs/>
-        </w:rPr>
-      </w:pPr>
-      <w:r>
-        <w:rPr>
-          <w:i/>
-          <w:iCs/>
-        </w:rPr>
-        <w:t>reprezentată prin  Vasilescu________ Director General şi  Matei______________ Director Economic, denumită în cele ce urmează subcontractant.</w:t>
+        <w:t xml:space="preserve">S.C.  SC SubEx SRL, Cluj; DG: Vasilescu, DE: Matei cu sediul în  SC SubEx SRL, Cluj; DG: Vasilescu, DE: Matei (adresa,tel.,fax)                                                     </w:t>
+      </w:r>
+    </w:p>
+    <w:p>
+      <w:pPr>
+        <w:tabs>
+          <w:tab w:val="left" w:pos="1593"/>
+        </w:tabs>
+        <w:rPr>
+          <w:i/>
+          <w:iCs/>
+        </w:rPr>
+      </w:pPr>
+      <w:r>
+        <w:rPr>
+          <w:i/>
+          <w:iCs/>
+        </w:rPr>
+        <w:t>reprezentată prin  Ionescu Mihai____ Director General şi  Ionescu Mihai______ Director Economic, denumită în cele ce urmează subcontractant.</w:t>
       </w:r>
     </w:p>
     <w:p>
@@ -12267,7 +12267,7 @@
           <w:i/>
           <w:iCs/>
         </w:rPr>
-        <w:t>şi neîncadrarea din vina subcontractantului,  în durata de execuţie angajată de contractantul general în faţa beneficiarului, subcontractantul va plăti penalitati de  0.1__% pe zi întarziere din valoarea  150000 RON__________________ nerealizată la termen.</w:t>
+        <w:t>şi neîncadrarea din vina subcontractantului,  în durata de execuţie angajată de contractantul general în faţa beneficiarului, subcontractantul va plăti penalitati de  0.1% pe zi intarziere% pe zi întarziere din valoarea  Servicii de consultanta IT__ nerealizată la termen.</w:t>
       </w:r>
     </w:p>
     <w:p>
@@ -12314,7 +12314,7 @@
           <w:i/>
           <w:iCs/>
         </w:rPr>
-        <w:t>Pentru nerespectarea termenelor de plata prevazute la art.3., contractantul general va plătii penalitati de  0.05 % pe zi întarziere la suma datorată.</w:t>
+        <w:t>Pentru nerespectarea termenelor de plata prevazute la art.3., contractantul general va plătii penalitati de  0.05% pe zi intarziere % pe zi întarziere la suma datorată.</w:t>
       </w:r>
     </w:p>
     <w:p>
@@ -12493,7 +12493,7 @@
           <w:i/>
           <w:iCs/>
         </w:rPr>
-        <w:t>SC BestBuild SRL_                                                                    SC SubEx SRL____</w:t>
+        <w:t>Autoritatea Contractanta X                                                                    Str. Exemplu 123, Bucuresti</w:t>
       </w:r>
     </w:p>
     <w:p>
@@ -12970,7 +12970,7 @@
           <w:i/>
           <w:lang w:val="hu-HU"/>
         </w:rPr>
-        <w:t>se va completa cu denumirea obiectivului), cod CPV ........................... organizată de  Autoritatea Contractanta X, Str. Exemplu 123, Bucuresti în calitate de autoritate contractantă</w:t>
+        <w:t>se va completa cu denumirea obiectivului), cod CPV  72222300-0....... organizată de  Autoritatea Contractanta X, Str. Exemplu 123, Bucuresti în calitate de autoritate contractantă</w:t>
       </w:r>
       <w:r>
         <w:rPr>
@@ -13113,7 +13113,7 @@
           <w:bCs/>
           <w:lang w:val="hu-HU" w:eastAsia="ar-SA"/>
         </w:rPr>
-        <w:t xml:space="preserve">……….. </w:t>
+        <w:t xml:space="preserve"> Autoritatea Contractanta X </w:t>
       </w:r>
       <w:r>
         <w:rPr>
@@ -13315,7 +13315,7 @@
         <w:rPr>
           <w:lang w:val="hu-HU" w:eastAsia="ar-SA"/>
         </w:rPr>
-        <w:t xml:space="preserve">Prezenta garanție este valabila pana la data de______ / ____ zile de la data emiterii </w:t>
+        <w:t xml:space="preserve">Prezenta garanție este valabila pana la data de 31/01/2026__ zile de la data emiterii </w:t>
       </w:r>
     </w:p>
     <w:p>
@@ -13540,7 +13540,7 @@
           <w:i/>
           <w:iCs/>
         </w:rPr>
-        <w:t xml:space="preserve">Subscrisa  SC BestBuild SRL...................................................................... (nume/denumire), cu sediul în  Str. Lalelelor 10, Bucuresti...(adresa operatorului economic),  înmatriculata la Registrul Comerţului sub nr.…, CIF ……....…, atribut fiscal ................, reprezentată prin ………………………, în calitate de ………………………………., împuternicim prin prezenta pe Dl/Dna ………………….……, domiciliat în ……………………………………………, identificat cu B.I./C.I. seria ……, nr. ………, CNP …………………………., eliberat de ……............................., la data de …………, având funcţia de ………………………………………………, să ne reprezinte la procedura de atribuire  </w:t>
+        <w:t xml:space="preserve">Subscrisa  SC BestBuild SRL...................................................................... (nume/denumire), cu sediul în  Str. Lalelelor 10, Bucuresti...(adresa operatorului economic),  înmatriculata la Registrul Comerţului sub nr.…, CIF  RO12345678, atribut fiscal  RO........., reprezentată prin  Ionescu Mihai, în calitate de  Administrator.........................., împuternicim prin prezenta pe Dl/Dna  Popa Andreea.............., domiciliat în  Str. Teiului 9, Brasov, identificat cu B.I./C.I. seria ……, nr.  123456, CNP  1800101223344.............., eliberat de …… SPCEP Brasov...., la data de  02/01/2018, având funcţia de  Manager licitatii, să ne reprezinte la procedura de atribuire  </w:t>
       </w:r>
       <w:r>
         <w:rPr>
@@ -14152,7 +14152,7 @@
           <w:i/>
           <w:iCs/>
         </w:rPr>
-        <w:t xml:space="preserve">..............................................                                                      </w:t>
+        <w:t xml:space="preserve">Vasile Ionescu.......................                                                      </w:t>
       </w:r>
     </w:p>
     <w:p>
@@ -14621,7 +14621,7 @@
         <w:rPr>
           <w:lang w:val="it-IT"/>
         </w:rPr>
-        <w:t>iei de participare nr. ______ din ______________, privind aplicarea procedurii de  Licitatia deschisa_</w:t>
+        <w:t>iei de participare nr.  ANUNT 123 din  15/09/2025___, privind aplicarea procedurii de  Licitatia deschisa_</w:t>
       </w:r>
       <w:r>
         <w:rPr>
@@ -14723,7 +14723,7 @@
         <w:rPr>
           <w:lang w:val="it-IT"/>
         </w:rPr>
-        <w:t>i marcat în mod vizibil, conţinând, în original şi într-un număr de ________ copii:</w:t>
+        <w:t>i marcat în mod vizibil, conţinând, în original şi într-un număr de  2______ copii:</w:t>
       </w:r>
     </w:p>
     <w:p>

</xml_diff>